<commit_message>
Update final documentation Word file
</commit_message>
<xml_diff>
--- a/SECR4483_AA_Documentation_B23CS0027_AQMAR ILHAN BIN MOHAMAD FADZILAH.docx
+++ b/SECR4483_AA_Documentation_B23CS0027_AQMAR ILHAN BIN MOHAMAD FADZILAH.docx
@@ -6825,12 +6825,17 @@
         <w:t xml:space="preserve">) &gt; 256. </w:t>
       </w:r>
       <w:proofErr w:type="spellStart"/>
+      <w:proofErr w:type="gramStart"/>
       <w:r>
         <w:t>strlen</w:t>
       </w:r>
       <w:proofErr w:type="spellEnd"/>
       <w:r>
-        <w:t>(), however, calculates the length of a string, in bytes, not in characters. UTF-8-encoded systems use 1-byte for standard ASCII characters and 2 to 4 bytes for multi-byte characters like Chinese, Arabic and emojis. This gives rise to a difference between the byte-length validation and character-length interpretation.</w:t>
+        <w:t>(</w:t>
+      </w:r>
+      <w:proofErr w:type="gramEnd"/>
+      <w:r>
+        <w:t>), however, calculates the length of a string, in bytes, not in characters. UTF-8-encoded systems use 1-byte for standard ASCII characters and 2 to 4 bytes for multi-byte characters like Chinese, Arabic and emojis. This gives rise to a difference between the byte-length validation and character-length interpretation.</w:t>
       </w:r>
     </w:p>
     <w:p>
@@ -6845,12 +6850,17 @@
         <w:t xml:space="preserve">This weakness may cause two security issues. One way is to return false positives, i.e., a semantically short input is rejected because of its size in bytes. For instance, 100 Chinese characters can be stored in about 300 bytes of memory (string) and overflow the 256-byte limit. Second, it can result in downstream truncation or buffer handling problems in components that handle characters in a manner distinct from raw bytes. So, while </w:t>
       </w:r>
       <w:proofErr w:type="spellStart"/>
+      <w:proofErr w:type="gramStart"/>
       <w:r>
         <w:t>strlen</w:t>
       </w:r>
       <w:proofErr w:type="spellEnd"/>
       <w:r>
-        <w:t>() alone isn't enough for safe UTF-8 input validation</w:t>
+        <w:t>(</w:t>
+      </w:r>
+      <w:proofErr w:type="gramEnd"/>
+      <w:r>
+        <w:t>) alone isn't enough for safe UTF-8 input validation</w:t>
       </w:r>
       <w:r>
         <w:rPr>
@@ -7210,8 +7220,13 @@
         <w:t xml:space="preserve">The Security Principle under Malaysian Personal Data Protection Act PDPA 2010 calls for the organization to implement reasonable and necessary measures to ensure that the personal data is not lost, misused, modified, accessed or disclosed without authorization. The system should have robust security measures to safeguard patient information and authentication </w:t>
       </w:r>
       <w:proofErr w:type="spellStart"/>
-      <w:r>
-        <w:t>details.E-MedicVault</w:t>
+      <w:proofErr w:type="gramStart"/>
+      <w:r>
+        <w:t>details.E</w:t>
+      </w:r>
+      <w:proofErr w:type="gramEnd"/>
+      <w:r>
+        <w:t>-MedicVault</w:t>
       </w:r>
       <w:proofErr w:type="spellEnd"/>
       <w:r>
@@ -7788,6 +7803,7 @@
         <w:t xml:space="preserve">: Output Encoding Using </w:t>
       </w:r>
       <w:proofErr w:type="spellStart"/>
+      <w:proofErr w:type="gramStart"/>
       <w:r>
         <w:rPr>
           <w:b/>
@@ -7801,7 +7817,15 @@
           <w:b/>
           <w:bCs/>
         </w:rPr>
-        <w:t>()</w:t>
+        <w:t>(</w:t>
+      </w:r>
+      <w:proofErr w:type="gramEnd"/>
+      <w:r>
+        <w:rPr>
+          <w:b/>
+          <w:bCs/>
+        </w:rPr>
+        <w:t>)</w:t>
       </w:r>
     </w:p>
     <w:p>
@@ -7817,12 +7841,17 @@
         <w:t xml:space="preserve">The secure version will also use </w:t>
       </w:r>
       <w:proofErr w:type="spellStart"/>
+      <w:proofErr w:type="gramStart"/>
       <w:r>
         <w:t>htmlspecialchars</w:t>
       </w:r>
       <w:proofErr w:type="spellEnd"/>
       <w:r>
-        <w:t>() to prevent this problem. This will convert special HTML characters into safe entities. As such, injected scripts will not be executed by the browser, only the normal text displayed</w:t>
+        <w:t>(</w:t>
+      </w:r>
+      <w:proofErr w:type="gramEnd"/>
+      <w:r>
+        <w:t>) to prevent this problem. This will convert special HTML characters into safe entities. As such, injected scripts will not be executed by the browser, only the normal text displayed</w:t>
       </w:r>
       <w:r>
         <w:rPr>
@@ -7889,12 +7918,17 @@
         <w:t xml:space="preserve">The only thing that </w:t>
       </w:r>
       <w:proofErr w:type="spellStart"/>
+      <w:proofErr w:type="gramStart"/>
       <w:r>
         <w:t>strlen</w:t>
       </w:r>
       <w:proofErr w:type="spellEnd"/>
       <w:r>
-        <w:t xml:space="preserve">() does in the legacy </w:t>
+        <w:t>(</w:t>
+      </w:r>
+      <w:proofErr w:type="gramEnd"/>
+      <w:r>
+        <w:t xml:space="preserve">) does in the legacy </w:t>
       </w:r>
       <w:proofErr w:type="spellStart"/>
       <w:r>
@@ -7905,12 +7939,17 @@
         <w:t xml:space="preserve"> is to check the length of the authentication key. </w:t>
       </w:r>
       <w:proofErr w:type="spellStart"/>
+      <w:proofErr w:type="gramStart"/>
       <w:r>
         <w:t>strlen</w:t>
       </w:r>
       <w:proofErr w:type="spellEnd"/>
       <w:r>
-        <w:t>(), however, counts the number of bytes, not characters. With this it becomes possible to get false validation for multi-byte UTF-8 characters in the input. It can also result in the lack of consistency in handling between the application and other system elements.</w:t>
+        <w:t>(</w:t>
+      </w:r>
+      <w:proofErr w:type="gramEnd"/>
+      <w:r>
+        <w:t>), however, counts the number of bytes, not characters. With this it becomes possible to get false validation for multi-byte UTF-8 characters in the input. It can also result in the lack of consistency in handling between the application and other system elements.</w:t>
       </w:r>
     </w:p>
     <w:p>
@@ -7927,11 +7966,19 @@
       </w:r>
       <w:proofErr w:type="spellStart"/>
       <w:r>
-        <w:t>mb_strlen</w:t>
+        <w:t>mb_</w:t>
+      </w:r>
+      <w:proofErr w:type="gramStart"/>
+      <w:r>
+        <w:t>strlen</w:t>
       </w:r>
       <w:proofErr w:type="spellEnd"/>
       <w:r>
-        <w:t>()) and validates the number of bytes (</w:t>
+        <w:t>(</w:t>
+      </w:r>
+      <w:proofErr w:type="gramEnd"/>
+      <w:r>
+        <w:t>)) and validates the number of bytes (</w:t>
       </w:r>
       <w:proofErr w:type="spellStart"/>
       <w:r>
@@ -8164,7 +8211,15 @@
           <w:b/>
           <w:bCs/>
         </w:rPr>
-        <w:t>password_verify</w:t>
+        <w:t>password_</w:t>
+      </w:r>
+      <w:proofErr w:type="gramStart"/>
+      <w:r>
+        <w:rPr>
+          <w:b/>
+          <w:bCs/>
+        </w:rPr>
+        <w:t>verify</w:t>
       </w:r>
       <w:proofErr w:type="spellEnd"/>
       <w:r>
@@ -8172,7 +8227,15 @@
           <w:b/>
           <w:bCs/>
         </w:rPr>
-        <w:t>()</w:t>
+        <w:t>(</w:t>
+      </w:r>
+      <w:proofErr w:type="gramEnd"/>
+      <w:r>
+        <w:rPr>
+          <w:b/>
+          <w:bCs/>
+        </w:rPr>
+        <w:t>)</w:t>
       </w:r>
     </w:p>
     <w:p/>
@@ -8190,11 +8253,19 @@
       </w:r>
       <w:proofErr w:type="spellStart"/>
       <w:r>
-        <w:t>password_hash</w:t>
+        <w:t>password_</w:t>
+      </w:r>
+      <w:proofErr w:type="gramStart"/>
+      <w:r>
+        <w:t>hash</w:t>
       </w:r>
       <w:proofErr w:type="spellEnd"/>
       <w:r>
-        <w:t xml:space="preserve">() and </w:t>
+        <w:t>(</w:t>
+      </w:r>
+      <w:proofErr w:type="gramEnd"/>
+      <w:r>
+        <w:t xml:space="preserve">) and </w:t>
       </w:r>
       <w:proofErr w:type="spellStart"/>
       <w:r>
@@ -8607,7 +8678,61 @@
                 <w:szCs w:val="22"/>
                 <w:lang w:val="en-US" w:eastAsia="en-US"/>
               </w:rPr>
-              <w:t xml:space="preserve"> WHERE name LIKE '%" . $keyword . "%'";$result = $conn-&gt;query($</w:t>
+              <w:t xml:space="preserve"> WHERE name LIKE '%</w:t>
+            </w:r>
+            <w:proofErr w:type="gramStart"/>
+            <w:r>
+              <w:rPr>
+                <w:sz w:val="22"/>
+                <w:szCs w:val="22"/>
+                <w:lang w:val="en-US" w:eastAsia="en-US"/>
+              </w:rPr>
+              <w:t>" .</w:t>
+            </w:r>
+            <w:proofErr w:type="gramEnd"/>
+            <w:r>
+              <w:rPr>
+                <w:sz w:val="22"/>
+                <w:szCs w:val="22"/>
+                <w:lang w:val="en-US" w:eastAsia="en-US"/>
+              </w:rPr>
+              <w:t xml:space="preserve"> $</w:t>
+            </w:r>
+            <w:proofErr w:type="gramStart"/>
+            <w:r>
+              <w:rPr>
+                <w:sz w:val="22"/>
+                <w:szCs w:val="22"/>
+                <w:lang w:val="en-US" w:eastAsia="en-US"/>
+              </w:rPr>
+              <w:t>keyword .</w:t>
+            </w:r>
+            <w:proofErr w:type="gramEnd"/>
+            <w:r>
+              <w:rPr>
+                <w:sz w:val="22"/>
+                <w:szCs w:val="22"/>
+                <w:lang w:val="en-US" w:eastAsia="en-US"/>
+              </w:rPr>
+              <w:t xml:space="preserve"> "%'</w:t>
+            </w:r>
+            <w:proofErr w:type="gramStart"/>
+            <w:r>
+              <w:rPr>
+                <w:sz w:val="22"/>
+                <w:szCs w:val="22"/>
+                <w:lang w:val="en-US" w:eastAsia="en-US"/>
+              </w:rPr>
+              <w:t>";$</w:t>
+            </w:r>
+            <w:proofErr w:type="gramEnd"/>
+            <w:r>
+              <w:rPr>
+                <w:sz w:val="22"/>
+                <w:szCs w:val="22"/>
+                <w:lang w:val="en-US" w:eastAsia="en-US"/>
+              </w:rPr>
+              <w:t>result = $conn-&gt;query($</w:t>
             </w:r>
             <w:proofErr w:type="spellStart"/>
             <w:r>
@@ -8703,7 +8828,25 @@
                 <w:szCs w:val="22"/>
                 <w:lang w:val="en-US" w:eastAsia="en-US"/>
               </w:rPr>
-              <w:t xml:space="preserve"> WHERE name LIKE :keyword";$</w:t>
+              <w:t xml:space="preserve"> WHERE name </w:t>
+            </w:r>
+            <w:proofErr w:type="gramStart"/>
+            <w:r>
+              <w:rPr>
+                <w:sz w:val="22"/>
+                <w:szCs w:val="22"/>
+                <w:lang w:val="en-US" w:eastAsia="en-US"/>
+              </w:rPr>
+              <w:t>LIKE :keyword</w:t>
+            </w:r>
+            <w:proofErr w:type="gramEnd"/>
+            <w:r>
+              <w:rPr>
+                <w:sz w:val="22"/>
+                <w:szCs w:val="22"/>
+                <w:lang w:val="en-US" w:eastAsia="en-US"/>
+              </w:rPr>
+              <w:t>";$</w:t>
             </w:r>
             <w:proofErr w:type="spellStart"/>
             <w:r>
@@ -8775,7 +8918,25 @@
                 <w:szCs w:val="22"/>
                 <w:lang w:val="en-US" w:eastAsia="en-US"/>
               </w:rPr>
-              <w:t>-&gt;execute([':keyword' =&gt; '%' . $keyword . '%']);</w:t>
+              <w:t>-&gt;execute([':keyword' =&gt; '%' . $</w:t>
+            </w:r>
+            <w:proofErr w:type="gramStart"/>
+            <w:r>
+              <w:rPr>
+                <w:sz w:val="22"/>
+                <w:szCs w:val="22"/>
+                <w:lang w:val="en-US" w:eastAsia="en-US"/>
+              </w:rPr>
+              <w:t>keyword .</w:t>
+            </w:r>
+            <w:proofErr w:type="gramEnd"/>
+            <w:r>
+              <w:rPr>
+                <w:sz w:val="22"/>
+                <w:szCs w:val="22"/>
+                <w:lang w:val="en-US" w:eastAsia="en-US"/>
+              </w:rPr>
+              <w:t xml:space="preserve"> '%']);</w:t>
             </w:r>
           </w:p>
         </w:tc>
@@ -8867,7 +9028,25 @@
                 <w:szCs w:val="22"/>
                 <w:lang w:val="en-US" w:eastAsia="en-US"/>
               </w:rPr>
-              <w:t>echo "Result found for keyword: " . $keyword;</w:t>
+              <w:t xml:space="preserve">echo "Result found for keyword: </w:t>
+            </w:r>
+            <w:proofErr w:type="gramStart"/>
+            <w:r>
+              <w:rPr>
+                <w:sz w:val="22"/>
+                <w:szCs w:val="22"/>
+                <w:lang w:val="en-US" w:eastAsia="en-US"/>
+              </w:rPr>
+              <w:t>" .</w:t>
+            </w:r>
+            <w:proofErr w:type="gramEnd"/>
+            <w:r>
+              <w:rPr>
+                <w:sz w:val="22"/>
+                <w:szCs w:val="22"/>
+                <w:lang w:val="en-US" w:eastAsia="en-US"/>
+              </w:rPr>
+              <w:t xml:space="preserve"> $keyword;</w:t>
             </w:r>
           </w:p>
         </w:tc>
@@ -8912,6 +9091,7 @@
               <w:t xml:space="preserve"> = </w:t>
             </w:r>
             <w:proofErr w:type="spellStart"/>
+            <w:proofErr w:type="gramStart"/>
             <w:r>
               <w:rPr>
                 <w:sz w:val="22"/>
@@ -8927,7 +9107,16 @@
                 <w:szCs w:val="22"/>
                 <w:lang w:val="en-US" w:eastAsia="en-US"/>
               </w:rPr>
-              <w:t>($keyword, ENT_QUOTES, "UTF-8");echo "Result found for keyword: " . $</w:t>
+              <w:t>(</w:t>
+            </w:r>
+            <w:proofErr w:type="gramEnd"/>
+            <w:r>
+              <w:rPr>
+                <w:sz w:val="22"/>
+                <w:szCs w:val="22"/>
+                <w:lang w:val="en-US" w:eastAsia="en-US"/>
+              </w:rPr>
+              <w:t>$keyword, ENT_QUOTES, "UTF-8");echo "Result found for keyword: " . $</w:t>
             </w:r>
             <w:proofErr w:type="spellStart"/>
             <w:r>
@@ -9124,7 +9313,16 @@
                 <w:szCs w:val="22"/>
                 <w:lang w:val="en-US" w:eastAsia="en-US"/>
               </w:rPr>
-              <w:t>password_hash</w:t>
+              <w:t>password_</w:t>
+            </w:r>
+            <w:proofErr w:type="gramStart"/>
+            <w:r>
+              <w:rPr>
+                <w:sz w:val="22"/>
+                <w:szCs w:val="22"/>
+                <w:lang w:val="en-US" w:eastAsia="en-US"/>
+              </w:rPr>
+              <w:t>hash</w:t>
             </w:r>
             <w:proofErr w:type="spellEnd"/>
             <w:r>
@@ -9133,7 +9331,16 @@
                 <w:szCs w:val="22"/>
                 <w:lang w:val="en-US" w:eastAsia="en-US"/>
               </w:rPr>
-              <w:t>($</w:t>
+              <w:t>(</w:t>
+            </w:r>
+            <w:proofErr w:type="gramEnd"/>
+            <w:r>
+              <w:rPr>
+                <w:sz w:val="22"/>
+                <w:szCs w:val="22"/>
+                <w:lang w:val="en-US" w:eastAsia="en-US"/>
+              </w:rPr>
+              <w:t>$</w:t>
             </w:r>
             <w:proofErr w:type="spellStart"/>
             <w:r>
@@ -9188,7 +9395,16 @@
                 <w:szCs w:val="22"/>
                 <w:lang w:val="en-US" w:eastAsia="en-US"/>
               </w:rPr>
-              <w:t>password_verify</w:t>
+              <w:t>password_</w:t>
+            </w:r>
+            <w:proofErr w:type="gramStart"/>
+            <w:r>
+              <w:rPr>
+                <w:sz w:val="22"/>
+                <w:szCs w:val="22"/>
+                <w:lang w:val="en-US" w:eastAsia="en-US"/>
+              </w:rPr>
+              <w:t>verify</w:t>
             </w:r>
             <w:proofErr w:type="spellEnd"/>
             <w:r>
@@ -9197,7 +9413,16 @@
                 <w:szCs w:val="22"/>
                 <w:lang w:val="en-US" w:eastAsia="en-US"/>
               </w:rPr>
-              <w:t>($</w:t>
+              <w:t>(</w:t>
+            </w:r>
+            <w:proofErr w:type="gramEnd"/>
+            <w:r>
+              <w:rPr>
+                <w:sz w:val="22"/>
+                <w:szCs w:val="22"/>
+                <w:lang w:val="en-US" w:eastAsia="en-US"/>
+              </w:rPr>
+              <w:t>$</w:t>
             </w:r>
             <w:proofErr w:type="spellStart"/>
             <w:r>
@@ -9397,7 +9622,25 @@
                 <w:szCs w:val="22"/>
                 <w:lang w:val="en-US" w:eastAsia="en-US"/>
               </w:rPr>
-              <w:t>) &gt; 256) { die("Overflow.");}</w:t>
+              <w:t xml:space="preserve">) &gt; 256) </w:t>
+            </w:r>
+            <w:proofErr w:type="gramStart"/>
+            <w:r>
+              <w:rPr>
+                <w:sz w:val="22"/>
+                <w:szCs w:val="22"/>
+                <w:lang w:val="en-US" w:eastAsia="en-US"/>
+              </w:rPr>
+              <w:t>{ die</w:t>
+            </w:r>
+            <w:proofErr w:type="gramEnd"/>
+            <w:r>
+              <w:rPr>
+                <w:sz w:val="22"/>
+                <w:szCs w:val="22"/>
+                <w:lang w:val="en-US" w:eastAsia="en-US"/>
+              </w:rPr>
+              <w:t>("Overflow.");}</w:t>
             </w:r>
           </w:p>
         </w:tc>
@@ -9430,7 +9673,16 @@
                 <w:szCs w:val="22"/>
                 <w:lang w:val="en-US" w:eastAsia="en-US"/>
               </w:rPr>
-              <w:t>mb_strlen</w:t>
+              <w:t>mb_</w:t>
+            </w:r>
+            <w:proofErr w:type="gramStart"/>
+            <w:r>
+              <w:rPr>
+                <w:sz w:val="22"/>
+                <w:szCs w:val="22"/>
+                <w:lang w:val="en-US" w:eastAsia="en-US"/>
+              </w:rPr>
+              <w:t>strlen</w:t>
             </w:r>
             <w:proofErr w:type="spellEnd"/>
             <w:r>
@@ -9439,7 +9691,16 @@
                 <w:szCs w:val="22"/>
                 <w:lang w:val="en-US" w:eastAsia="en-US"/>
               </w:rPr>
-              <w:t>($</w:t>
+              <w:t>(</w:t>
+            </w:r>
+            <w:proofErr w:type="gramEnd"/>
+            <w:r>
+              <w:rPr>
+                <w:sz w:val="22"/>
+                <w:szCs w:val="22"/>
+                <w:lang w:val="en-US" w:eastAsia="en-US"/>
+              </w:rPr>
+              <w:t>$</w:t>
             </w:r>
             <w:proofErr w:type="spellStart"/>
             <w:r>
@@ -10541,11 +10802,19 @@
       </w:r>
       <w:proofErr w:type="spellStart"/>
       <w:r>
-        <w:t>openssl_decrypt</w:t>
+        <w:t>openssl_</w:t>
+      </w:r>
+      <w:proofErr w:type="gramStart"/>
+      <w:r>
+        <w:t>decrypt</w:t>
       </w:r>
       <w:proofErr w:type="spellEnd"/>
       <w:r>
-        <w:t>(). The authentication tag is checked prior to returning the original plaintext</w:t>
+        <w:t>(</w:t>
+      </w:r>
+      <w:proofErr w:type="gramEnd"/>
+      <w:r>
+        <w:t>). The authentication tag is checked prior to returning the original plaintext</w:t>
       </w:r>
       <w:r>
         <w:rPr>
@@ -10757,11 +11026,19 @@
       </w:r>
       <w:proofErr w:type="spellStart"/>
       <w:r>
-        <w:t>openssl_decrypt</w:t>
+        <w:t>openssl_</w:t>
+      </w:r>
+      <w:proofErr w:type="gramStart"/>
+      <w:r>
+        <w:t>decrypt</w:t>
       </w:r>
       <w:proofErr w:type="spellEnd"/>
       <w:r>
-        <w:t xml:space="preserve">() will return false. If not handled correctly, the application can handle invalid data, expose to the user too much error information, or behave erratically. A structured exception </w:t>
+        <w:t>(</w:t>
+      </w:r>
+      <w:proofErr w:type="gramEnd"/>
+      <w:r>
+        <w:t xml:space="preserve">) will return false. If not handled correctly, the application can handle invalid data, expose to the user too much error information, or behave erratically. A structured exception </w:t>
       </w:r>
       <w:r>
         <w:lastRenderedPageBreak/>
@@ -10807,9 +11084,17 @@
         <w:rPr>
           <w:szCs w:val="24"/>
         </w:rPr>
-        <w:t>Operational Decoupling of Secrets Using .env</w:t>
+        <w:t xml:space="preserve">Operational Decoupling of Secrets </w:t>
+      </w:r>
+      <w:proofErr w:type="gramStart"/>
+      <w:r>
+        <w:rPr>
+          <w:szCs w:val="24"/>
+        </w:rPr>
+        <w:t>Using .env</w:t>
       </w:r>
       <w:bookmarkEnd w:id="35"/>
+      <w:proofErr w:type="gramEnd"/>
     </w:p>
     <w:p>
       <w:pPr>
@@ -10860,13 +11145,18 @@
         </w:rPr>
       </w:pPr>
       <w:r>
-        <w:t>Once secrets have been moved into the .env file they should be ignored by version control with the .</w:t>
+        <w:t xml:space="preserve">Once secrets have been moved into the .env file they should be ignored by version control with </w:t>
+      </w:r>
+      <w:proofErr w:type="gramStart"/>
+      <w:r>
+        <w:t>the .</w:t>
       </w:r>
       <w:proofErr w:type="spellStart"/>
       <w:r>
         <w:t>gitignore</w:t>
       </w:r>
       <w:proofErr w:type="spellEnd"/>
+      <w:proofErr w:type="gramEnd"/>
       <w:r>
         <w:t xml:space="preserve"> file. This ensures that sensitive keys, database passwords and local configuration paths are not uploaded to public or shared repositories. If the application does not include environment-specific configuration files, the chances of accidentally exposing these credentials and the public attack surface of the application are reduced</w:t>
       </w:r>
@@ -11946,12 +12236,17 @@
         <w:t xml:space="preserve"> was refactored with multiple secure programming controls to break the chain of exploits. The secure version uses PDO prepared statements to make sure there is a separation between SQL statements and user input. It also uses </w:t>
       </w:r>
       <w:proofErr w:type="spellStart"/>
+      <w:proofErr w:type="gramStart"/>
       <w:r>
         <w:t>htmlspecialchars</w:t>
       </w:r>
       <w:proofErr w:type="spellEnd"/>
       <w:r>
-        <w:t>() in its output so as to prevent reflected XSS from happening. The authentication module includes better multi-byte input validation and switches off MD5 for password hashing for better security and uses Argon2id instead. The cryptographic subsystem changes AES-128-ECB for AES-256-GCM, which allows for authenticated encryption with associated confidentiality and integrity. A summary of these code changes is provided in the comparative matrix in Chapter 2</w:t>
+        <w:t>(</w:t>
+      </w:r>
+      <w:proofErr w:type="gramEnd"/>
+      <w:r>
+        <w:t>) in its output so as to prevent reflected XSS from happening. The authentication module includes better multi-byte input validation and switches off MD5 for password hashing for better security and uses Argon2id instead. The cryptographic subsystem changes AES-128-ECB for AES-256-GCM, which allows for authenticated encryption with associated confidentiality and integrity. A summary of these code changes is provided in the comparative matrix in Chapter 2</w:t>
       </w:r>
       <w:r>
         <w:rPr>
@@ -12374,6 +12669,7 @@
               </w:rPr>
             </w:pPr>
             <w:proofErr w:type="spellStart"/>
+            <w:proofErr w:type="gramStart"/>
             <w:r>
               <w:rPr>
                 <w:szCs w:val="24"/>
@@ -12387,7 +12683,15 @@
                 <w:szCs w:val="24"/>
                 <w:lang w:val="en-US" w:eastAsia="en-US"/>
               </w:rPr>
-              <w:t>()</w:t>
+              <w:t>(</w:t>
+            </w:r>
+            <w:proofErr w:type="gramEnd"/>
+            <w:r>
+              <w:rPr>
+                <w:szCs w:val="24"/>
+                <w:lang w:val="en-US" w:eastAsia="en-US"/>
+              </w:rPr>
+              <w:t>)</w:t>
             </w:r>
           </w:p>
         </w:tc>
@@ -12531,6 +12835,7 @@
               </w:rPr>
             </w:pPr>
             <w:proofErr w:type="spellStart"/>
+            <w:proofErr w:type="gramStart"/>
             <w:r>
               <w:rPr>
                 <w:szCs w:val="24"/>
@@ -12544,7 +12849,15 @@
                 <w:szCs w:val="24"/>
                 <w:lang w:val="en-US" w:eastAsia="en-US"/>
               </w:rPr>
-              <w:t>() only</w:t>
+              <w:t>(</w:t>
+            </w:r>
+            <w:proofErr w:type="gramEnd"/>
+            <w:r>
+              <w:rPr>
+                <w:szCs w:val="24"/>
+                <w:lang w:val="en-US" w:eastAsia="en-US"/>
+              </w:rPr>
+              <w:t>) only</w:t>
             </w:r>
           </w:p>
         </w:tc>
@@ -12589,7 +12902,15 @@
                 <w:szCs w:val="24"/>
                 <w:lang w:val="en-US" w:eastAsia="en-US"/>
               </w:rPr>
-              <w:t>mb_strlen</w:t>
+              <w:t>mb_</w:t>
+            </w:r>
+            <w:proofErr w:type="gramStart"/>
+            <w:r>
+              <w:rPr>
+                <w:szCs w:val="24"/>
+                <w:lang w:val="en-US" w:eastAsia="en-US"/>
+              </w:rPr>
+              <w:t>strlen</w:t>
             </w:r>
             <w:proofErr w:type="spellEnd"/>
             <w:r>
@@ -12597,7 +12918,15 @@
                 <w:szCs w:val="24"/>
                 <w:lang w:val="en-US" w:eastAsia="en-US"/>
               </w:rPr>
-              <w:t>() + byte limit</w:t>
+              <w:t>(</w:t>
+            </w:r>
+            <w:proofErr w:type="gramEnd"/>
+            <w:r>
+              <w:rPr>
+                <w:szCs w:val="24"/>
+                <w:lang w:val="en-US" w:eastAsia="en-US"/>
+              </w:rPr>
+              <w:t>) + byte limit</w:t>
             </w:r>
           </w:p>
         </w:tc>
@@ -12687,7 +13016,23 @@
                 <w:szCs w:val="24"/>
                 <w:lang w:val="en-US" w:eastAsia="en-US"/>
               </w:rPr>
-              <w:t>AES-256-GCM and .env key storage</w:t>
+              <w:t xml:space="preserve">AES-256-GCM </w:t>
+            </w:r>
+            <w:proofErr w:type="gramStart"/>
+            <w:r>
+              <w:rPr>
+                <w:szCs w:val="24"/>
+                <w:lang w:val="en-US" w:eastAsia="en-US"/>
+              </w:rPr>
+              <w:t>and .env</w:t>
+            </w:r>
+            <w:proofErr w:type="gramEnd"/>
+            <w:r>
+              <w:rPr>
+                <w:szCs w:val="24"/>
+                <w:lang w:val="en-US" w:eastAsia="en-US"/>
+              </w:rPr>
+              <w:t xml:space="preserve"> key storage</w:t>
             </w:r>
           </w:p>
         </w:tc>
@@ -15637,28 +15982,28 @@
 </file>
 
 <file path=customXml/item1.xml><?xml version="1.0" encoding="utf-8"?>
+<b:Sources xmlns:b="http://schemas.openxmlformats.org/officeDocument/2006/bibliography" xmlns="http://schemas.openxmlformats.org/officeDocument/2006/bibliography" SelectedStyle="\APASixthEditionOfficeOnline.xsl" StyleName="APA" Version="6"/>
+</file>
+
+<file path=customXml/item2.xml><?xml version="1.0" encoding="utf-8"?>
 <go:gDocsCustomXmlDataStorage xmlns:go="http://customooxmlschemas.google.com/" xmlns:r="http://schemas.openxmlformats.org/officeDocument/2006/relationships" uri="GoogleDocsCustomDataVersion2">
   <go:docsCustomData xmlns:go="http://customooxmlschemas.google.com/" roundtripDataSignature="AMtx7miO+1mEQ6WUlaejNUcaPQO/+jHwoQ==">CgMxLjA4AHIhMTA0dG54cUtrMU5GZlJabEM4Wk9VUHBRZEpjd3JaaUdu</go:docsCustomData>
 </go:gDocsCustomXmlDataStorage>
 </file>
 
-<file path=customXml/item2.xml><?xml version="1.0" encoding="utf-8"?>
-<b:Sources xmlns:b="http://schemas.openxmlformats.org/officeDocument/2006/bibliography" xmlns="http://schemas.openxmlformats.org/officeDocument/2006/bibliography" SelectedStyle="\APASixthEditionOfficeOnline.xsl" StyleName="APA" Version="6"/>
+<file path=customXml/itemProps1.xml><?xml version="1.0" encoding="utf-8"?>
+<ds:datastoreItem xmlns:ds="http://schemas.openxmlformats.org/officeDocument/2006/customXml" ds:itemID="{E410086D-D917-449C-B35E-41148FB03299}">
+  <ds:schemaRefs>
+    <ds:schemaRef ds:uri="http://schemas.openxmlformats.org/officeDocument/2006/bibliography"/>
+  </ds:schemaRefs>
+</ds:datastoreItem>
 </file>
 
-<file path=customXml/itemProps1.xml><?xml version="1.0" encoding="utf-8"?>
+<file path=customXml/itemProps2.xml><?xml version="1.0" encoding="utf-8"?>
 <ds:datastoreItem xmlns:ds="http://schemas.openxmlformats.org/officeDocument/2006/customXml" ds:itemID="{11111111-1234-1234-1234-123412341234}">
   <ds:schemaRefs>
     <ds:schemaRef ds:uri="http://customooxmlschemas.google.com/"/>
     <ds:schemaRef ds:uri="http://schemas.openxmlformats.org/officeDocument/2006/relationships"/>
   </ds:schemaRefs>
 </ds:datastoreItem>
-</file>
-
-<file path=customXml/itemProps2.xml><?xml version="1.0" encoding="utf-8"?>
-<ds:datastoreItem xmlns:ds="http://schemas.openxmlformats.org/officeDocument/2006/customXml" ds:itemID="{E410086D-D917-449C-B35E-41148FB03299}">
-  <ds:schemaRefs>
-    <ds:schemaRef ds:uri="http://schemas.openxmlformats.org/officeDocument/2006/bibliography"/>
-  </ds:schemaRefs>
-</ds:datastoreItem>
 </file>
</xml_diff>